<commit_message>
docs: correct drift-step claim — driftStep/isDriftRegion are unused
src/Integrator.h:159 (driftStep) and src/LatticeManager.h:245
(isDriftRegion) are defined but never called from main.cpp or
optimizer.cpp — borisStep is invoked unconditionally. The earlier docs
incorrectly stated the simplified drift path was active. Updated both
the markdown and the GOST DOCX (regenerated via docs/build_docx.js).

Co-Authored-By: Claude Opus 4.7 (1M context) <noreply@anthropic.com>
</commit_message>
<xml_diff>
--- a/docs/algorithms.docx
+++ b/docs/algorithms.docx
@@ -2522,7 +2522,7 @@
           <w:sz w:val="28"/>
           <w:szCs w:val="28"/>
         </w:rPr>
-        <w:t xml:space="preserve">Для участков дрейфа (в окрестности позиции нет магнитов, lattice.isDriftRegion(pos) = true) применяется упрощённый Integrator::driftStep: координата обновляется как pos += (mom / (m0·γ)) · dt, импульс не изменяется. Это даёт дополнительный выигрыш по производительности на участках свободного пролёта.</w:t>
+        <w:t xml:space="preserve">В исходных файлах присутствуют вспомогательные методы Integrator::driftStep и AcceleratorConfig::isDriftRegion, предназначенные для замены полного шага Бориса аналитическим дрейфом x += v·dt на участках без магнитов. Однако в текущей версии кода ни тот, ни другой метод не вызываются: borisStep применяется единообразно. Прескрининг по bucket-индексу (см. раздел 3) уже сводит шаг в пустой области к одному обращению к бакету и пустому циклу по кандидатам, поэтому отдельная ветка для дрейфа практической пользы не даёт.</w:t>
       </w:r>
     </w:p>
     <w:p>
@@ -4006,7 +4006,7 @@
           <w:sz w:val="28"/>
           <w:szCs w:val="28"/>
         </w:rPr>
-        <w:t xml:space="preserve">Ускорение поиска магнитов, потенциально вносящих вклад в поле в точке текущей позиции частицы. Без индекса симулятор должен был бы перебирать все ~2762 элемента кольца на каждом шаге. Индекс снижает число кандидатов до ~5 на шаг и позволяет в ~95 % случаев распознавать участки чистого дрейфа, где применяется упрощённое уравнение движения.</w:t>
+        <w:t xml:space="preserve">Ускорение поиска магнитов, потенциально вносящих вклад в поле в точке текущей позиции частицы. Без индекса симулятор должен был бы перебирать все ~2762 элемента кольца на каждом шаге. Индекс снижает число кандидатов до ~5 на шаг; на участках чистого дрейфа бакет пуст, и стоимость шага сводится к одному обращению к бакету без вычислений поля.</w:t>
       </w:r>
     </w:p>
     <w:p>
@@ -5183,7 +5183,7 @@
           <w:sz w:val="28"/>
           <w:szCs w:val="28"/>
         </w:rPr>
-        <w:t xml:space="preserve">Проверка участка дрейфа: isDriftRegion(pos) возвращает true, если бакет пуст или координаты выходят за сетку. В этом случае вызывающий код может использовать вместо borisStep упрощённый driftStep.</w:t>
+        <w:t xml:space="preserve">Вспомогательный метод isDriftRegion(pos) возвращает true, если бакет пуст или координаты выходят за сетку. Изначально предполагалось, что вызывающий код использует его для переключения на упрощённый driftStep вместо borisStep, однако в текущей версии трекера и оптимизатора этот вызов не задействован — borisStep применяется единообразно.</w:t>
       </w:r>
     </w:p>
     <w:p>
@@ -10209,7 +10209,7 @@
           <w:sz w:val="22"/>
           <w:szCs w:val="22"/>
         </w:rPr>
-        <w:t xml:space="preserve">    шаг Boris/drift</w:t>
+        <w:t xml:space="preserve">    шаг Бориса (borisStep)</w:t>
       </w:r>
       <w:r>
         <w:br/>

</xml_diff>

<commit_message>
docs(algorithms.docx): drop auto PAGEREF in TOC, leave page numbers blank
Per user — page numbers will be filled in manually in Word.
tocItem() no longer emits a PageReference field; the line ends after
the dot leader, leaving the right column blank for hand-editing.
The chapter title remains a clickable InternalHyperlink, so Ctrl+Click
still jumps to the section.

PageReference dropped from the docx imports.

Verified: PAGEREF count = 0; bookmarks and hyperlinks both 14
(clickable TOC intact); formula labels 69; OMML 180.

Co-Authored-By: Claude Opus 4.7 (1M context) <noreply@anthropic.com>
</commit_message>
<xml_diff>
--- a/docs/algorithms.docx
+++ b/docs/algorithms.docx
@@ -257,20 +257,13 @@
           </w:rPr>
           <w:t xml:space="preserve">Введение</w:t>
         </w:r>
-      </w:hyperlink>
-      <w:r>
-        <w:rPr>
-          <w:rFonts w:ascii="Times New Roman" w:cs="Times New Roman" w:eastAsia="Times New Roman" w:hAnsi="Times New Roman"/>
-          <w:sz w:val="28"/>
-          <w:szCs w:val="28"/>
-        </w:rPr>
-        <w:t xml:space="preserve">	</w:t>
-      </w:r>
-      <w:hyperlink w:history="1" w:anchor="sec_intro">
         <w:r>
-          <w:fldChar w:fldCharType="begin" w:dirty="true"/>
-          <w:instrText xml:space="preserve">PAGEREF sec_intro</w:instrText>
-          <w:fldChar w:fldCharType="end"/>
+          <w:rPr>
+            <w:rFonts w:ascii="Times New Roman" w:cs="Times New Roman" w:eastAsia="Times New Roman" w:hAnsi="Times New Roman"/>
+            <w:sz w:val="28"/>
+            <w:szCs w:val="28"/>
+          </w:rPr>
+          <w:t xml:space="preserve">	</w:t>
         </w:r>
       </w:hyperlink>
     </w:p>
@@ -291,20 +284,13 @@
           </w:rPr>
           <w:t xml:space="preserve">1 Интегратор Бориса — релятивистский симплектический интегратор</w:t>
         </w:r>
-      </w:hyperlink>
-      <w:r>
-        <w:rPr>
-          <w:rFonts w:ascii="Times New Roman" w:cs="Times New Roman" w:eastAsia="Times New Roman" w:hAnsi="Times New Roman"/>
-          <w:sz w:val="28"/>
-          <w:szCs w:val="28"/>
-        </w:rPr>
-        <w:t xml:space="preserve">	</w:t>
-      </w:r>
-      <w:hyperlink w:history="1" w:anchor="sec_1">
         <w:r>
-          <w:fldChar w:fldCharType="begin" w:dirty="true"/>
-          <w:instrText xml:space="preserve">PAGEREF sec_1</w:instrText>
-          <w:fldChar w:fldCharType="end"/>
+          <w:rPr>
+            <w:rFonts w:ascii="Times New Roman" w:cs="Times New Roman" w:eastAsia="Times New Roman" w:hAnsi="Times New Roman"/>
+            <w:sz w:val="28"/>
+            <w:szCs w:val="28"/>
+          </w:rPr>
+          <w:t xml:space="preserve">	</w:t>
         </w:r>
       </w:hyperlink>
     </w:p>
@@ -325,20 +311,13 @@
           </w:rPr>
           <w:t xml:space="preserve">2 Трилинейная интерполяция поля с учётом YZ-симметрии</w:t>
         </w:r>
-      </w:hyperlink>
-      <w:r>
-        <w:rPr>
-          <w:rFonts w:ascii="Times New Roman" w:cs="Times New Roman" w:eastAsia="Times New Roman" w:hAnsi="Times New Roman"/>
-          <w:sz w:val="28"/>
-          <w:szCs w:val="28"/>
-        </w:rPr>
-        <w:t xml:space="preserve">	</w:t>
-      </w:r>
-      <w:hyperlink w:history="1" w:anchor="sec_2">
         <w:r>
-          <w:fldChar w:fldCharType="begin" w:dirty="true"/>
-          <w:instrText xml:space="preserve">PAGEREF sec_2</w:instrText>
-          <w:fldChar w:fldCharType="end"/>
+          <w:rPr>
+            <w:rFonts w:ascii="Times New Roman" w:cs="Times New Roman" w:eastAsia="Times New Roman" w:hAnsi="Times New Roman"/>
+            <w:sz w:val="28"/>
+            <w:szCs w:val="28"/>
+          </w:rPr>
+          <w:t xml:space="preserve">	</w:t>
         </w:r>
       </w:hyperlink>
     </w:p>
@@ -359,20 +338,13 @@
           </w:rPr>
           <w:t xml:space="preserve">3 Двумерный bucket-индекс магнитов</w:t>
         </w:r>
-      </w:hyperlink>
-      <w:r>
-        <w:rPr>
-          <w:rFonts w:ascii="Times New Roman" w:cs="Times New Roman" w:eastAsia="Times New Roman" w:hAnsi="Times New Roman"/>
-          <w:sz w:val="28"/>
-          <w:szCs w:val="28"/>
-        </w:rPr>
-        <w:t xml:space="preserve">	</w:t>
-      </w:r>
-      <w:hyperlink w:history="1" w:anchor="sec_3">
         <w:r>
-          <w:fldChar w:fldCharType="begin" w:dirty="true"/>
-          <w:instrText xml:space="preserve">PAGEREF sec_3</w:instrText>
-          <w:fldChar w:fldCharType="end"/>
+          <w:rPr>
+            <w:rFonts w:ascii="Times New Roman" w:cs="Times New Roman" w:eastAsia="Times New Roman" w:hAnsi="Times New Roman"/>
+            <w:sz w:val="28"/>
+            <w:szCs w:val="28"/>
+          </w:rPr>
+          <w:t xml:space="preserve">	</w:t>
         </w:r>
       </w:hyperlink>
     </w:p>
@@ -393,20 +365,13 @@
           </w:rPr>
           <w:t xml:space="preserve">4 Вклад магнита с прескринингом по охватывающей сфере</w:t>
         </w:r>
-      </w:hyperlink>
-      <w:r>
-        <w:rPr>
-          <w:rFonts w:ascii="Times New Roman" w:cs="Times New Roman" w:eastAsia="Times New Roman" w:hAnsi="Times New Roman"/>
-          <w:sz w:val="28"/>
-          <w:szCs w:val="28"/>
-        </w:rPr>
-        <w:t xml:space="preserve">	</w:t>
-      </w:r>
-      <w:hyperlink w:history="1" w:anchor="sec_4">
         <w:r>
-          <w:fldChar w:fldCharType="begin" w:dirty="true"/>
-          <w:instrText xml:space="preserve">PAGEREF sec_4</w:instrText>
-          <w:fldChar w:fldCharType="end"/>
+          <w:rPr>
+            <w:rFonts w:ascii="Times New Roman" w:cs="Times New Roman" w:eastAsia="Times New Roman" w:hAnsi="Times New Roman"/>
+            <w:sz w:val="28"/>
+            <w:szCs w:val="28"/>
+          </w:rPr>
+          <w:t xml:space="preserve">	</w:t>
         </w:r>
       </w:hyperlink>
     </w:p>
@@ -427,20 +392,13 @@
           </w:rPr>
           <w:t xml:space="preserve">5 Детектор пересечения финишной плоскости</w:t>
         </w:r>
-      </w:hyperlink>
-      <w:r>
-        <w:rPr>
-          <w:rFonts w:ascii="Times New Roman" w:cs="Times New Roman" w:eastAsia="Times New Roman" w:hAnsi="Times New Roman"/>
-          <w:sz w:val="28"/>
-          <w:szCs w:val="28"/>
-        </w:rPr>
-        <w:t xml:space="preserve">	</w:t>
-      </w:r>
-      <w:hyperlink w:history="1" w:anchor="sec_5">
         <w:r>
-          <w:fldChar w:fldCharType="begin" w:dirty="true"/>
-          <w:instrText xml:space="preserve">PAGEREF sec_5</w:instrText>
-          <w:fldChar w:fldCharType="end"/>
+          <w:rPr>
+            <w:rFonts w:ascii="Times New Roman" w:cs="Times New Roman" w:eastAsia="Times New Roman" w:hAnsi="Times New Roman"/>
+            <w:sz w:val="28"/>
+            <w:szCs w:val="28"/>
+          </w:rPr>
+          <w:t xml:space="preserve">	</w:t>
         </w:r>
       </w:hyperlink>
     </w:p>
@@ -461,20 +419,13 @@
           </w:rPr>
           <w:t xml:space="preserve">6 Расстояние от точки до полилинии проектной орбиты</w:t>
         </w:r>
-      </w:hyperlink>
-      <w:r>
-        <w:rPr>
-          <w:rFonts w:ascii="Times New Roman" w:cs="Times New Roman" w:eastAsia="Times New Roman" w:hAnsi="Times New Roman"/>
-          <w:sz w:val="28"/>
-          <w:szCs w:val="28"/>
-        </w:rPr>
-        <w:t xml:space="preserve">	</w:t>
-      </w:r>
-      <w:hyperlink w:history="1" w:anchor="sec_6">
         <w:r>
-          <w:fldChar w:fldCharType="begin" w:dirty="true"/>
-          <w:instrText xml:space="preserve">PAGEREF sec_6</w:instrText>
-          <w:fldChar w:fldCharType="end"/>
+          <w:rPr>
+            <w:rFonts w:ascii="Times New Roman" w:cs="Times New Roman" w:eastAsia="Times New Roman" w:hAnsi="Times New Roman"/>
+            <w:sz w:val="28"/>
+            <w:szCs w:val="28"/>
+          </w:rPr>
+          <w:t xml:space="preserve">	</w:t>
         </w:r>
       </w:hyperlink>
     </w:p>
@@ -495,20 +446,13 @@
           </w:rPr>
           <w:t xml:space="preserve">7 Составная функция потерь оптимизатора</w:t>
         </w:r>
-      </w:hyperlink>
-      <w:r>
-        <w:rPr>
-          <w:rFonts w:ascii="Times New Roman" w:cs="Times New Roman" w:eastAsia="Times New Roman" w:hAnsi="Times New Roman"/>
-          <w:sz w:val="28"/>
-          <w:szCs w:val="28"/>
-        </w:rPr>
-        <w:t xml:space="preserve">	</w:t>
-      </w:r>
-      <w:hyperlink w:history="1" w:anchor="sec_7">
         <w:r>
-          <w:fldChar w:fldCharType="begin" w:dirty="true"/>
-          <w:instrText xml:space="preserve">PAGEREF sec_7</w:instrText>
-          <w:fldChar w:fldCharType="end"/>
+          <w:rPr>
+            <w:rFonts w:ascii="Times New Roman" w:cs="Times New Roman" w:eastAsia="Times New Roman" w:hAnsi="Times New Roman"/>
+            <w:sz w:val="28"/>
+            <w:szCs w:val="28"/>
+          </w:rPr>
+          <w:t xml:space="preserve">	</w:t>
         </w:r>
       </w:hyperlink>
     </w:p>
@@ -529,20 +473,13 @@
           </w:rPr>
           <w:t xml:space="preserve">8 Стохастический оптимизатор (hill-climber c киками)</w:t>
         </w:r>
-      </w:hyperlink>
-      <w:r>
-        <w:rPr>
-          <w:rFonts w:ascii="Times New Roman" w:cs="Times New Roman" w:eastAsia="Times New Roman" w:hAnsi="Times New Roman"/>
-          <w:sz w:val="28"/>
-          <w:szCs w:val="28"/>
-        </w:rPr>
-        <w:t xml:space="preserve">	</w:t>
-      </w:r>
-      <w:hyperlink w:history="1" w:anchor="sec_8">
         <w:r>
-          <w:fldChar w:fldCharType="begin" w:dirty="true"/>
-          <w:instrText xml:space="preserve">PAGEREF sec_8</w:instrText>
-          <w:fldChar w:fldCharType="end"/>
+          <w:rPr>
+            <w:rFonts w:ascii="Times New Roman" w:cs="Times New Roman" w:eastAsia="Times New Roman" w:hAnsi="Times New Roman"/>
+            <w:sz w:val="28"/>
+            <w:szCs w:val="28"/>
+          </w:rPr>
+          <w:t xml:space="preserve">	</w:t>
         </w:r>
       </w:hyperlink>
     </w:p>
@@ -563,20 +500,13 @@
           </w:rPr>
           <w:t xml:space="preserve">9 Генерация решётки из LTE-описания</w:t>
         </w:r>
-      </w:hyperlink>
-      <w:r>
-        <w:rPr>
-          <w:rFonts w:ascii="Times New Roman" w:cs="Times New Roman" w:eastAsia="Times New Roman" w:hAnsi="Times New Roman"/>
-          <w:sz w:val="28"/>
-          <w:szCs w:val="28"/>
-        </w:rPr>
-        <w:t xml:space="preserve">	</w:t>
-      </w:r>
-      <w:hyperlink w:history="1" w:anchor="sec_9">
         <w:r>
-          <w:fldChar w:fldCharType="begin" w:dirty="true"/>
-          <w:instrText xml:space="preserve">PAGEREF sec_9</w:instrText>
-          <w:fldChar w:fldCharType="end"/>
+          <w:rPr>
+            <w:rFonts w:ascii="Times New Roman" w:cs="Times New Roman" w:eastAsia="Times New Roman" w:hAnsi="Times New Roman"/>
+            <w:sz w:val="28"/>
+            <w:szCs w:val="28"/>
+          </w:rPr>
+          <w:t xml:space="preserve">	</w:t>
         </w:r>
       </w:hyperlink>
     </w:p>
@@ -597,20 +527,13 @@
           </w:rPr>
           <w:t xml:space="preserve">10 Сборка таблицы конфигурации и суб-решёток</w:t>
         </w:r>
-      </w:hyperlink>
-      <w:r>
-        <w:rPr>
-          <w:rFonts w:ascii="Times New Roman" w:cs="Times New Roman" w:eastAsia="Times New Roman" w:hAnsi="Times New Roman"/>
-          <w:sz w:val="28"/>
-          <w:szCs w:val="28"/>
-        </w:rPr>
-        <w:t xml:space="preserve">	</w:t>
-      </w:r>
-      <w:hyperlink w:history="1" w:anchor="sec_10">
         <w:r>
-          <w:fldChar w:fldCharType="begin" w:dirty="true"/>
-          <w:instrText xml:space="preserve">PAGEREF sec_10</w:instrText>
-          <w:fldChar w:fldCharType="end"/>
+          <w:rPr>
+            <w:rFonts w:ascii="Times New Roman" w:cs="Times New Roman" w:eastAsia="Times New Roman" w:hAnsi="Times New Roman"/>
+            <w:sz w:val="28"/>
+            <w:szCs w:val="28"/>
+          </w:rPr>
+          <w:t xml:space="preserve">	</w:t>
         </w:r>
       </w:hyperlink>
     </w:p>
@@ -631,20 +554,13 @@
           </w:rPr>
           <w:t xml:space="preserve">11 Анализ огибающей и бетатронных частот по FFT</w:t>
         </w:r>
-      </w:hyperlink>
-      <w:r>
-        <w:rPr>
-          <w:rFonts w:ascii="Times New Roman" w:cs="Times New Roman" w:eastAsia="Times New Roman" w:hAnsi="Times New Roman"/>
-          <w:sz w:val="28"/>
-          <w:szCs w:val="28"/>
-        </w:rPr>
-        <w:t xml:space="preserve">	</w:t>
-      </w:r>
-      <w:hyperlink w:history="1" w:anchor="sec_11">
         <w:r>
-          <w:fldChar w:fldCharType="begin" w:dirty="true"/>
-          <w:instrText xml:space="preserve">PAGEREF sec_11</w:instrText>
-          <w:fldChar w:fldCharType="end"/>
+          <w:rPr>
+            <w:rFonts w:ascii="Times New Roman" w:cs="Times New Roman" w:eastAsia="Times New Roman" w:hAnsi="Times New Roman"/>
+            <w:sz w:val="28"/>
+            <w:szCs w:val="28"/>
+          </w:rPr>
+          <w:t xml:space="preserve">	</w:t>
         </w:r>
       </w:hyperlink>
     </w:p>
@@ -665,20 +581,13 @@
           </w:rPr>
           <w:t xml:space="preserve">А Приложение А. Файлы конфигурации</w:t>
         </w:r>
-      </w:hyperlink>
-      <w:r>
-        <w:rPr>
-          <w:rFonts w:ascii="Times New Roman" w:cs="Times New Roman" w:eastAsia="Times New Roman" w:hAnsi="Times New Roman"/>
-          <w:sz w:val="28"/>
-          <w:szCs w:val="28"/>
-        </w:rPr>
-        <w:t xml:space="preserve">	</w:t>
-      </w:r>
-      <w:hyperlink w:history="1" w:anchor="sec_a">
         <w:r>
-          <w:fldChar w:fldCharType="begin" w:dirty="true"/>
-          <w:instrText xml:space="preserve">PAGEREF sec_a</w:instrText>
-          <w:fldChar w:fldCharType="end"/>
+          <w:rPr>
+            <w:rFonts w:ascii="Times New Roman" w:cs="Times New Roman" w:eastAsia="Times New Roman" w:hAnsi="Times New Roman"/>
+            <w:sz w:val="28"/>
+            <w:szCs w:val="28"/>
+          </w:rPr>
+          <w:t xml:space="preserve">	</w:t>
         </w:r>
       </w:hyperlink>
     </w:p>
@@ -699,20 +608,13 @@
           </w:rPr>
           <w:t xml:space="preserve">Б Приложение Б. Файлы данных</w:t>
         </w:r>
-      </w:hyperlink>
-      <w:r>
-        <w:rPr>
-          <w:rFonts w:ascii="Times New Roman" w:cs="Times New Roman" w:eastAsia="Times New Roman" w:hAnsi="Times New Roman"/>
-          <w:sz w:val="28"/>
-          <w:szCs w:val="28"/>
-        </w:rPr>
-        <w:t xml:space="preserve">	</w:t>
-      </w:r>
-      <w:hyperlink w:history="1" w:anchor="sec_b">
         <w:r>
-          <w:fldChar w:fldCharType="begin" w:dirty="true"/>
-          <w:instrText xml:space="preserve">PAGEREF sec_b</w:instrText>
-          <w:fldChar w:fldCharType="end"/>
+          <w:rPr>
+            <w:rFonts w:ascii="Times New Roman" w:cs="Times New Roman" w:eastAsia="Times New Roman" w:hAnsi="Times New Roman"/>
+            <w:sz w:val="28"/>
+            <w:szCs w:val="28"/>
+          </w:rPr>
+          <w:t xml:space="preserve">	</w:t>
         </w:r>
       </w:hyperlink>
     </w:p>

</xml_diff>

<commit_message>
docs(algorithms.docx): fix two math-formula glitches
1. §1.4 "где: γ ≥ 1 — …": the leading entry was built as
   sub('γ', '') ≥ 1, which Word rendered as a γ followed by an
   empty subscript placeholder (the visible empty box in the user's
   screenshot). Empty subscript dropped — now plain 'γ ≥ 1'.

2. §1.4 step-4 formula γ⁻ = √(1 + |p⁻|² / (m²c²)) was built with
   sup('|', sup('p', '−')) which rendered as a vertical bar with a
   superscript p⁻ instead of the intended |p⁻|². Fixed to wrap the
   bars properly: sup(['|', sup('p', '−'), '|'], '2').

Verified: zero empty <m:sub>/<m:sup> placeholders remain in the
regenerated docx; 180 OMML formulas and 69 numbered labels intact.

Co-Authored-By: Claude Opus 4.7 (1M context) <noreply@anthropic.com>
</commit_message>
<xml_diff>
--- a/docs/algorithms.docx
+++ b/docs/algorithms.docx
@@ -2687,21 +2687,8 @@
         <w:t xml:space="preserve">— </w:t>
       </w:r>
       <m:oMath>
-        <m:sSub>
-          <m:sSubPr/>
-          <m:e>
-            <m:r>
-              <m:t>γ</m:t>
-            </m:r>
-          </m:e>
-          <m:sub>
-            <m:r>
-              <m:t/>
-            </m:r>
-          </m:sub>
-        </m:sSub>
         <m:r>
-          <m:t> ≥ 1</m:t>
+          <m:t>γ ≥ 1</m:t>
         </m:r>
       </m:oMath>
       <w:r>
@@ -3568,8 +3555,6 @@
                     <m:r>
                       <m:t>|</m:t>
                     </m:r>
-                  </m:e>
-                  <m:sup>
                     <m:sSup>
                       <m:sSupPr/>
                       <m:e>
@@ -3583,6 +3568,14 @@
                         </m:r>
                       </m:sup>
                     </m:sSup>
+                    <m:r>
+                      <m:t>|</m:t>
+                    </m:r>
+                  </m:e>
+                  <m:sup>
+                    <m:r>
+                      <m:t>2</m:t>
+                    </m:r>
                   </m:sup>
                 </m:sSup>
               </m:num>

</xml_diff>

<commit_message>
docs(algorithms.docx): add vertical spacer after every table
Word does not honour space-after on a <w:tbl> element itself, so
tables were rendering flush against the next paragraph. Added a
small helper tableSpacer() that emits an empty paragraph with
1.5-line spacing and "after: 120" — about half a line of extra
breathing room.

The three table helpers (table2col, table3col, table4col) now
return [Table, tableSpacer()] instead of a bare Table. The final
Document children list applies .flat() so the [Table, spacer] pair
flattens into the linear sequence Word expects. No callsite changes
required — the spacer is automatic for every table.

Verified: 19 tables in the regenerated docx, each followed by an
empty spacer paragraph; 180 OMML formulas, 69 formula labels,
14 bookmarks and 14 hyperlinks all intact.

Co-Authored-By: Claude Opus 4.7 (1M context) <noreply@anthropic.com>
</commit_message>
<xml_diff>
--- a/docs/algorithms.docx
+++ b/docs/algorithms.docx
@@ -1879,6 +1879,20 @@
     </w:tbl>
     <w:p>
       <w:pPr>
+        <w:spacing w:after="120" w:before="0" w:line="360" w:lineRule="auto"/>
+        <w:ind w:firstLine="0"/>
+      </w:pPr>
+      <w:r>
+        <w:rPr>
+          <w:rFonts w:ascii="Times New Roman" w:cs="Times New Roman" w:eastAsia="Times New Roman" w:hAnsi="Times New Roman"/>
+          <w:sz w:val="28"/>
+          <w:szCs w:val="28"/>
+        </w:rPr>
+        <w:t xml:space="preserve"/>
+      </w:r>
+    </w:p>
+    <w:p>
+      <w:pPr>
         <w:pStyle w:val="Heading2"/>
         <w:spacing w:after="140" w:before="280" w:line="360" w:lineRule="auto"/>
         <w:ind w:firstLine="709"/>
@@ -2147,6 +2161,20 @@
         </w:tc>
       </w:tr>
     </w:tbl>
+    <w:p>
+      <w:pPr>
+        <w:spacing w:after="120" w:before="0" w:line="360" w:lineRule="auto"/>
+        <w:ind w:firstLine="0"/>
+      </w:pPr>
+      <w:r>
+        <w:rPr>
+          <w:rFonts w:ascii="Times New Roman" w:cs="Times New Roman" w:eastAsia="Times New Roman" w:hAnsi="Times New Roman"/>
+          <w:sz w:val="28"/>
+          <w:szCs w:val="28"/>
+        </w:rPr>
+        <w:t xml:space="preserve"/>
+      </w:r>
+    </w:p>
     <w:p>
       <w:pPr>
         <w:pStyle w:val="Heading2"/>
@@ -5811,6 +5839,20 @@
     </w:tbl>
     <w:p>
       <w:pPr>
+        <w:spacing w:after="120" w:before="0" w:line="360" w:lineRule="auto"/>
+        <w:ind w:firstLine="0"/>
+      </w:pPr>
+      <w:r>
+        <w:rPr>
+          <w:rFonts w:ascii="Times New Roman" w:cs="Times New Roman" w:eastAsia="Times New Roman" w:hAnsi="Times New Roman"/>
+          <w:sz w:val="28"/>
+          <w:szCs w:val="28"/>
+        </w:rPr>
+        <w:t xml:space="preserve"/>
+      </w:r>
+    </w:p>
+    <w:p>
+      <w:pPr>
         <w:pStyle w:val="Heading2"/>
         <w:spacing w:after="140" w:before="280" w:line="360" w:lineRule="auto"/>
         <w:ind w:firstLine="709"/>
@@ -8094,6 +8136,20 @@
         </w:tc>
       </w:tr>
     </w:tbl>
+    <w:p>
+      <w:pPr>
+        <w:spacing w:after="120" w:before="0" w:line="360" w:lineRule="auto"/>
+        <w:ind w:firstLine="0"/>
+      </w:pPr>
+      <w:r>
+        <w:rPr>
+          <w:rFonts w:ascii="Times New Roman" w:cs="Times New Roman" w:eastAsia="Times New Roman" w:hAnsi="Times New Roman"/>
+          <w:sz w:val="28"/>
+          <w:szCs w:val="28"/>
+        </w:rPr>
+        <w:t xml:space="preserve"/>
+      </w:r>
+    </w:p>
     <w:p>
       <w:pPr>
         <w:pStyle w:val="Heading2"/>
@@ -8508,6 +8564,20 @@
         </w:tc>
       </w:tr>
     </w:tbl>
+    <w:p>
+      <w:pPr>
+        <w:spacing w:after="120" w:before="0" w:line="360" w:lineRule="auto"/>
+        <w:ind w:firstLine="0"/>
+      </w:pPr>
+      <w:r>
+        <w:rPr>
+          <w:rFonts w:ascii="Times New Roman" w:cs="Times New Roman" w:eastAsia="Times New Roman" w:hAnsi="Times New Roman"/>
+          <w:sz w:val="28"/>
+          <w:szCs w:val="28"/>
+        </w:rPr>
+        <w:t xml:space="preserve"/>
+      </w:r>
+    </w:p>
     <w:p>
       <w:pPr>
         <w:spacing w:after="60" w:line="360" w:lineRule="auto"/>
@@ -10620,6 +10690,20 @@
     </w:tbl>
     <w:p>
       <w:pPr>
+        <w:spacing w:after="120" w:before="0" w:line="360" w:lineRule="auto"/>
+        <w:ind w:firstLine="0"/>
+      </w:pPr>
+      <w:r>
+        <w:rPr>
+          <w:rFonts w:ascii="Times New Roman" w:cs="Times New Roman" w:eastAsia="Times New Roman" w:hAnsi="Times New Roman"/>
+          <w:sz w:val="28"/>
+          <w:szCs w:val="28"/>
+        </w:rPr>
+        <w:t xml:space="preserve"/>
+      </w:r>
+    </w:p>
+    <w:p>
+      <w:pPr>
         <w:spacing w:after="60" w:line="360" w:lineRule="auto"/>
         <w:ind w:firstLine="709"/>
         <w:jc w:val="both"/>
@@ -12958,6 +13042,20 @@
     </w:tbl>
     <w:p>
       <w:pPr>
+        <w:spacing w:after="120" w:before="0" w:line="360" w:lineRule="auto"/>
+        <w:ind w:firstLine="0"/>
+      </w:pPr>
+      <w:r>
+        <w:rPr>
+          <w:rFonts w:ascii="Times New Roman" w:cs="Times New Roman" w:eastAsia="Times New Roman" w:hAnsi="Times New Roman"/>
+          <w:sz w:val="28"/>
+          <w:szCs w:val="28"/>
+        </w:rPr>
+        <w:t xml:space="preserve"/>
+      </w:r>
+    </w:p>
+    <w:p>
+      <w:pPr>
         <w:pStyle w:val="Heading2"/>
         <w:spacing w:after="140" w:before="280" w:line="360" w:lineRule="auto"/>
         <w:ind w:firstLine="709"/>
@@ -14088,6 +14186,20 @@
         </w:tc>
       </w:tr>
     </w:tbl>
+    <w:p>
+      <w:pPr>
+        <w:spacing w:after="120" w:before="0" w:line="360" w:lineRule="auto"/>
+        <w:ind w:firstLine="0"/>
+      </w:pPr>
+      <w:r>
+        <w:rPr>
+          <w:rFonts w:ascii="Times New Roman" w:cs="Times New Roman" w:eastAsia="Times New Roman" w:hAnsi="Times New Roman"/>
+          <w:sz w:val="28"/>
+          <w:szCs w:val="28"/>
+        </w:rPr>
+        <w:t xml:space="preserve"/>
+      </w:r>
+    </w:p>
     <w:p>
       <w:pPr>
         <w:pStyle w:val="Heading2"/>
@@ -16194,6 +16306,20 @@
     </w:tbl>
     <w:p>
       <w:pPr>
+        <w:spacing w:after="120" w:before="0" w:line="360" w:lineRule="auto"/>
+        <w:ind w:firstLine="0"/>
+      </w:pPr>
+      <w:r>
+        <w:rPr>
+          <w:rFonts w:ascii="Times New Roman" w:cs="Times New Roman" w:eastAsia="Times New Roman" w:hAnsi="Times New Roman"/>
+          <w:sz w:val="28"/>
+          <w:szCs w:val="28"/>
+        </w:rPr>
+        <w:t xml:space="preserve"/>
+      </w:r>
+    </w:p>
+    <w:p>
+      <w:pPr>
         <w:pStyle w:val="Heading2"/>
         <w:spacing w:after="140" w:before="280" w:line="360" w:lineRule="auto"/>
         <w:ind w:firstLine="709"/>
@@ -16606,6 +16732,20 @@
         </w:tc>
       </w:tr>
     </w:tbl>
+    <w:p>
+      <w:pPr>
+        <w:spacing w:after="120" w:before="0" w:line="360" w:lineRule="auto"/>
+        <w:ind w:firstLine="0"/>
+      </w:pPr>
+      <w:r>
+        <w:rPr>
+          <w:rFonts w:ascii="Times New Roman" w:cs="Times New Roman" w:eastAsia="Times New Roman" w:hAnsi="Times New Roman"/>
+          <w:sz w:val="28"/>
+          <w:szCs w:val="28"/>
+        </w:rPr>
+        <w:t xml:space="preserve"/>
+      </w:r>
+    </w:p>
     <w:p>
       <w:pPr>
         <w:pStyle w:val="Heading2"/>
@@ -19570,6 +19710,20 @@
     </w:tbl>
     <w:p>
       <w:pPr>
+        <w:spacing w:after="120" w:before="0" w:line="360" w:lineRule="auto"/>
+        <w:ind w:firstLine="0"/>
+      </w:pPr>
+      <w:r>
+        <w:rPr>
+          <w:rFonts w:ascii="Times New Roman" w:cs="Times New Roman" w:eastAsia="Times New Roman" w:hAnsi="Times New Roman"/>
+          <w:sz w:val="28"/>
+          <w:szCs w:val="28"/>
+        </w:rPr>
+        <w:t xml:space="preserve"/>
+      </w:r>
+    </w:p>
+    <w:p>
+      <w:pPr>
         <w:pStyle w:val="Heading2"/>
         <w:spacing w:after="140" w:before="280" w:line="360" w:lineRule="auto"/>
         <w:ind w:firstLine="709"/>
@@ -19984,6 +20138,20 @@
     </w:tbl>
     <w:p>
       <w:pPr>
+        <w:spacing w:after="120" w:before="0" w:line="360" w:lineRule="auto"/>
+        <w:ind w:firstLine="0"/>
+      </w:pPr>
+      <w:r>
+        <w:rPr>
+          <w:rFonts w:ascii="Times New Roman" w:cs="Times New Roman" w:eastAsia="Times New Roman" w:hAnsi="Times New Roman"/>
+          <w:sz w:val="28"/>
+          <w:szCs w:val="28"/>
+        </w:rPr>
+        <w:t xml:space="preserve"/>
+      </w:r>
+    </w:p>
+    <w:p>
+      <w:pPr>
         <w:pStyle w:val="Heading2"/>
         <w:spacing w:after="140" w:before="280" w:line="360" w:lineRule="auto"/>
         <w:ind w:firstLine="709"/>
@@ -21948,6 +22116,20 @@
     </w:tbl>
     <w:p>
       <w:pPr>
+        <w:spacing w:after="120" w:before="0" w:line="360" w:lineRule="auto"/>
+        <w:ind w:firstLine="0"/>
+      </w:pPr>
+      <w:r>
+        <w:rPr>
+          <w:rFonts w:ascii="Times New Roman" w:cs="Times New Roman" w:eastAsia="Times New Roman" w:hAnsi="Times New Roman"/>
+          <w:sz w:val="28"/>
+          <w:szCs w:val="28"/>
+        </w:rPr>
+        <w:t xml:space="preserve"/>
+      </w:r>
+    </w:p>
+    <w:p>
+      <w:pPr>
         <w:pStyle w:val="Heading2"/>
         <w:spacing w:after="140" w:before="280" w:line="360" w:lineRule="auto"/>
         <w:ind w:firstLine="709"/>
@@ -22216,6 +22398,20 @@
         </w:tc>
       </w:tr>
     </w:tbl>
+    <w:p>
+      <w:pPr>
+        <w:spacing w:after="120" w:before="0" w:line="360" w:lineRule="auto"/>
+        <w:ind w:firstLine="0"/>
+      </w:pPr>
+      <w:r>
+        <w:rPr>
+          <w:rFonts w:ascii="Times New Roman" w:cs="Times New Roman" w:eastAsia="Times New Roman" w:hAnsi="Times New Roman"/>
+          <w:sz w:val="28"/>
+          <w:szCs w:val="28"/>
+        </w:rPr>
+        <w:t xml:space="preserve"/>
+      </w:r>
+    </w:p>
     <w:p>
       <w:pPr>
         <w:pStyle w:val="Heading2"/>
@@ -23486,6 +23682,20 @@
     </w:tbl>
     <w:p>
       <w:pPr>
+        <w:spacing w:after="120" w:before="0" w:line="360" w:lineRule="auto"/>
+        <w:ind w:firstLine="0"/>
+      </w:pPr>
+      <w:r>
+        <w:rPr>
+          <w:rFonts w:ascii="Times New Roman" w:cs="Times New Roman" w:eastAsia="Times New Roman" w:hAnsi="Times New Roman"/>
+          <w:sz w:val="28"/>
+          <w:szCs w:val="28"/>
+        </w:rPr>
+        <w:t xml:space="preserve"/>
+      </w:r>
+    </w:p>
+    <w:p>
+      <w:pPr>
         <w:pStyle w:val="Heading2"/>
         <w:spacing w:after="140" w:before="280" w:line="360" w:lineRule="auto"/>
         <w:ind w:firstLine="709"/>
@@ -23682,6 +23892,20 @@
         </w:tc>
       </w:tr>
     </w:tbl>
+    <w:p>
+      <w:pPr>
+        <w:spacing w:after="120" w:before="0" w:line="360" w:lineRule="auto"/>
+        <w:ind w:firstLine="0"/>
+      </w:pPr>
+      <w:r>
+        <w:rPr>
+          <w:rFonts w:ascii="Times New Roman" w:cs="Times New Roman" w:eastAsia="Times New Roman" w:hAnsi="Times New Roman"/>
+          <w:sz w:val="28"/>
+          <w:szCs w:val="28"/>
+        </w:rPr>
+        <w:t xml:space="preserve"/>
+      </w:r>
+    </w:p>
     <w:p>
       <w:pPr>
         <w:pStyle w:val="Heading2"/>
@@ -24664,6 +24888,20 @@
         </w:tc>
       </w:tr>
     </w:tbl>
+    <w:p>
+      <w:pPr>
+        <w:spacing w:after="120" w:before="0" w:line="360" w:lineRule="auto"/>
+        <w:ind w:firstLine="0"/>
+      </w:pPr>
+      <w:r>
+        <w:rPr>
+          <w:rFonts w:ascii="Times New Roman" w:cs="Times New Roman" w:eastAsia="Times New Roman" w:hAnsi="Times New Roman"/>
+          <w:sz w:val="28"/>
+          <w:szCs w:val="28"/>
+        </w:rPr>
+        <w:t xml:space="preserve"/>
+      </w:r>
+    </w:p>
     <w:p>
       <w:pPr>
         <w:pStyle w:val="Heading2"/>
@@ -27518,6 +27756,20 @@
         </w:tc>
       </w:tr>
     </w:tbl>
+    <w:p>
+      <w:pPr>
+        <w:spacing w:after="120" w:before="0" w:line="360" w:lineRule="auto"/>
+        <w:ind w:firstLine="0"/>
+      </w:pPr>
+      <w:r>
+        <w:rPr>
+          <w:rFonts w:ascii="Times New Roman" w:cs="Times New Roman" w:eastAsia="Times New Roman" w:hAnsi="Times New Roman"/>
+          <w:sz w:val="28"/>
+          <w:szCs w:val="28"/>
+        </w:rPr>
+        <w:t xml:space="preserve"/>
+      </w:r>
+    </w:p>
     <w:p>
       <w:pPr>
         <w:pStyle w:val="Heading1"/>
@@ -28664,6 +28916,20 @@
     </w:tbl>
     <w:p>
       <w:pPr>
+        <w:spacing w:after="120" w:before="0" w:line="360" w:lineRule="auto"/>
+        <w:ind w:firstLine="0"/>
+      </w:pPr>
+      <w:r>
+        <w:rPr>
+          <w:rFonts w:ascii="Times New Roman" w:cs="Times New Roman" w:eastAsia="Times New Roman" w:hAnsi="Times New Roman"/>
+          <w:sz w:val="28"/>
+          <w:szCs w:val="28"/>
+        </w:rPr>
+        <w:t xml:space="preserve"/>
+      </w:r>
+    </w:p>
+    <w:p>
+      <w:pPr>
         <w:spacing w:after="60" w:line="360" w:lineRule="auto"/>
         <w:ind w:firstLine="709"/>
         <w:jc w:val="both"/>

</xml_diff>